<commit_message>
feat: complete full Lab03 LINQPad exercise set
</commit_message>
<xml_diff>
--- a/Lab03/BaoCao_Lab03_NguyenHuynhPhuongDong_3124411071.docx
+++ b/Lab03/BaoCao_Lab03_NguyenHuynhPhuongDong_3124411071.docx
@@ -6697,7 +6697,7 @@
               <w:rPr>
                 <w:sz w:val="20"/>
               </w:rPr>
-              <w:t>Bai31_ThongKe.linq</w:t>
+              <w:t>Bai22_MangChuoi.linq</w:t>
             </w:r>
           </w:p>
         </w:tc>
@@ -6719,7 +6719,7 @@
               <w:rPr>
                 <w:sz w:val="20"/>
               </w:rPr>
-              <w:t>Count, Sum, Max, Min, Distinct và GroupBy</w:t>
+              <w:t>Lọc, sắp xếp và biến đổi chuỗi</w:t>
             </w:r>
           </w:p>
         </w:tc>
@@ -6747,7 +6747,7 @@
               <w:rPr>
                 <w:sz w:val="20"/>
               </w:rPr>
-              <w:t>Bai62_Join.linq</w:t>
+              <w:t>Bai31_ThongKe.linq</w:t>
             </w:r>
           </w:p>
         </w:tc>
@@ -6770,7 +6770,7 @@
               <w:rPr>
                 <w:sz w:val="20"/>
               </w:rPr>
-              <w:t>Inner join và group join + DefaultIfEmpty</w:t>
+              <w:t>Count, Sum, Max, Min, Distinct và GroupBy</w:t>
             </w:r>
           </w:p>
         </w:tc>
@@ -6797,7 +6797,7 @@
               <w:rPr>
                 <w:sz w:val="20"/>
               </w:rPr>
-              <w:t>GhiChu_LINQPad.md</w:t>
+              <w:t>Bai32_ThongKeChuoi.linq</w:t>
             </w:r>
           </w:p>
         </w:tc>
@@ -6819,7 +6819,258 @@
               <w:rPr>
                 <w:sz w:val="20"/>
               </w:rPr>
-              <w:t>Cách chạy, nhận xét và cơ chế thực thi trì hoãn</w:t>
+              <w:t>Min/Max độ dài, nhóm từ đầu và đếm</w:t>
+            </w:r>
+          </w:p>
+        </w:tc>
+      </w:tr>
+      <w:tr>
+        <w:trPr>
+          <w:cantSplit/>
+        </w:trPr>
+        <w:tc>
+          <w:tcPr>
+            <w:tcW w:type="dxa" w:w="4762"/>
+            <w:shd w:fill="EAF2F8"/>
+            <w:tcMar>
+              <w:top w:w="150" w:type="dxa"/>
+              <w:start w:w="190" w:type="dxa"/>
+              <w:bottom w:w="150" w:type="dxa"/>
+              <w:end w:w="190" w:type="dxa"/>
+            </w:tcMar>
+          </w:tcPr>
+          <w:p>
+            <w:pPr>
+              <w:spacing w:after="0"/>
+            </w:pPr>
+            <w:r>
+              <w:rPr>
+                <w:sz w:val="20"/>
+              </w:rPr>
+              <w:t>Bai41_DuLieuMonHoc.linq</w:t>
+            </w:r>
+          </w:p>
+        </w:tc>
+        <w:tc>
+          <w:tcPr>
+            <w:tcW w:type="dxa" w:w="4762"/>
+            <w:shd w:fill="EAF2F8"/>
+            <w:tcMar>
+              <w:top w:w="150" w:type="dxa"/>
+              <w:start w:w="190" w:type="dxa"/>
+              <w:bottom w:w="150" w:type="dxa"/>
+              <w:end w:w="190" w:type="dxa"/>
+            </w:tcMar>
+          </w:tcPr>
+          <w:p>
+            <w:pPr>
+              <w:spacing w:after="0"/>
+            </w:pPr>
+            <w:r>
+              <w:rPr>
+                <w:sz w:val="20"/>
+              </w:rPr>
+              <w:t>Lớp MonHoc và đầy đủ 18 môn học</w:t>
+            </w:r>
+          </w:p>
+        </w:tc>
+      </w:tr>
+      <w:tr>
+        <w:trPr>
+          <w:cantSplit/>
+        </w:trPr>
+        <w:tc>
+          <w:tcPr>
+            <w:tcW w:type="dxa" w:w="4762"/>
+            <w:tcMar>
+              <w:top w:w="150" w:type="dxa"/>
+              <w:start w:w="190" w:type="dxa"/>
+              <w:bottom w:w="150" w:type="dxa"/>
+              <w:end w:w="190" w:type="dxa"/>
+            </w:tcMar>
+          </w:tcPr>
+          <w:p>
+            <w:pPr>
+              <w:spacing w:after="0"/>
+            </w:pPr>
+            <w:r>
+              <w:rPr>
+                <w:sz w:val="20"/>
+              </w:rPr>
+              <w:t>Bai51_TruyVanMonHoc.linq</w:t>
+            </w:r>
+          </w:p>
+        </w:tc>
+        <w:tc>
+          <w:tcPr>
+            <w:tcW w:type="dxa" w:w="4762"/>
+            <w:tcMar>
+              <w:top w:w="150" w:type="dxa"/>
+              <w:start w:w="190" w:type="dxa"/>
+              <w:bottom w:w="150" w:type="dxa"/>
+              <w:end w:w="190" w:type="dxa"/>
+            </w:tcMar>
+          </w:tcPr>
+          <w:p>
+            <w:pPr>
+              <w:spacing w:after="0"/>
+            </w:pPr>
+            <w:r>
+              <w:rPr>
+                <w:sz w:val="20"/>
+              </w:rPr>
+              <w:t>Đầy đủ bốn truy vấn lọc và sắp xếp</w:t>
+            </w:r>
+          </w:p>
+        </w:tc>
+      </w:tr>
+      <w:tr>
+        <w:trPr>
+          <w:cantSplit/>
+        </w:trPr>
+        <w:tc>
+          <w:tcPr>
+            <w:tcW w:type="dxa" w:w="4762"/>
+            <w:shd w:fill="EAF2F8"/>
+            <w:tcMar>
+              <w:top w:w="150" w:type="dxa"/>
+              <w:start w:w="190" w:type="dxa"/>
+              <w:bottom w:w="150" w:type="dxa"/>
+              <w:end w:w="190" w:type="dxa"/>
+            </w:tcMar>
+          </w:tcPr>
+          <w:p>
+            <w:pPr>
+              <w:spacing w:after="0"/>
+            </w:pPr>
+            <w:r>
+              <w:rPr>
+                <w:sz w:val="20"/>
+              </w:rPr>
+              <w:t>Bai52_ThongKeMonHoc.linq</w:t>
+            </w:r>
+          </w:p>
+        </w:tc>
+        <w:tc>
+          <w:tcPr>
+            <w:tcW w:type="dxa" w:w="4762"/>
+            <w:shd w:fill="EAF2F8"/>
+            <w:tcMar>
+              <w:top w:w="150" w:type="dxa"/>
+              <w:start w:w="190" w:type="dxa"/>
+              <w:bottom w:w="150" w:type="dxa"/>
+              <w:end w:w="190" w:type="dxa"/>
+            </w:tcMar>
+          </w:tcPr>
+          <w:p>
+            <w:pPr>
+              <w:spacing w:after="0"/>
+            </w:pPr>
+            <w:r>
+              <w:rPr>
+                <w:sz w:val="20"/>
+              </w:rPr>
+              <w:t>Đầy đủ các truy vấn a đến k</w:t>
+            </w:r>
+          </w:p>
+        </w:tc>
+      </w:tr>
+      <w:tr>
+        <w:trPr>
+          <w:cantSplit/>
+        </w:trPr>
+        <w:tc>
+          <w:tcPr>
+            <w:tcW w:type="dxa" w:w="4762"/>
+            <w:tcMar>
+              <w:top w:w="150" w:type="dxa"/>
+              <w:start w:w="190" w:type="dxa"/>
+              <w:bottom w:w="150" w:type="dxa"/>
+              <w:end w:w="190" w:type="dxa"/>
+            </w:tcMar>
+          </w:tcPr>
+          <w:p>
+            <w:pPr>
+              <w:spacing w:after="0"/>
+            </w:pPr>
+            <w:r>
+              <w:rPr>
+                <w:sz w:val="20"/>
+              </w:rPr>
+              <w:t>Bai61_DuLieuHe.linq</w:t>
+            </w:r>
+          </w:p>
+        </w:tc>
+        <w:tc>
+          <w:tcPr>
+            <w:tcW w:type="dxa" w:w="4762"/>
+            <w:tcMar>
+              <w:top w:w="150" w:type="dxa"/>
+              <w:start w:w="190" w:type="dxa"/>
+              <w:bottom w:w="150" w:type="dxa"/>
+              <w:end w:w="190" w:type="dxa"/>
+            </w:tcMar>
+          </w:tcPr>
+          <w:p>
+            <w:pPr>
+              <w:spacing w:after="0"/>
+            </w:pPr>
+            <w:r>
+              <w:rPr>
+                <w:sz w:val="20"/>
+              </w:rPr>
+              <w:t>Lớp He và ba hệ đào tạo</w:t>
+            </w:r>
+          </w:p>
+        </w:tc>
+      </w:tr>
+      <w:tr>
+        <w:trPr>
+          <w:cantSplit/>
+        </w:trPr>
+        <w:tc>
+          <w:tcPr>
+            <w:tcW w:type="dxa" w:w="4762"/>
+            <w:shd w:fill="EAF2F8"/>
+            <w:tcMar>
+              <w:top w:w="150" w:type="dxa"/>
+              <w:start w:w="190" w:type="dxa"/>
+              <w:bottom w:w="150" w:type="dxa"/>
+              <w:end w:w="190" w:type="dxa"/>
+            </w:tcMar>
+          </w:tcPr>
+          <w:p>
+            <w:pPr>
+              <w:spacing w:after="0"/>
+            </w:pPr>
+            <w:r>
+              <w:rPr>
+                <w:sz w:val="20"/>
+              </w:rPr>
+              <w:t>Bai62_Join.linq</w:t>
+            </w:r>
+          </w:p>
+        </w:tc>
+        <w:tc>
+          <w:tcPr>
+            <w:tcW w:type="dxa" w:w="4762"/>
+            <w:shd w:fill="EAF2F8"/>
+            <w:tcMar>
+              <w:top w:w="150" w:type="dxa"/>
+              <w:start w:w="190" w:type="dxa"/>
+              <w:bottom w:w="150" w:type="dxa"/>
+              <w:end w:w="190" w:type="dxa"/>
+            </w:tcMar>
+          </w:tcPr>
+          <w:p>
+            <w:pPr>
+              <w:spacing w:after="0"/>
+            </w:pPr>
+            <w:r>
+              <w:rPr>
+                <w:sz w:val="20"/>
+              </w:rPr>
+              <w:t>Đầy đủ các truy vấn join a đến i</w:t>
             </w:r>
           </w:p>
         </w:tc>
@@ -6827,7 +7078,7 @@
     </w:tbl>
     <w:p>
       <w:r>
-        <w:t>Trong LINQPad, chế độ C# Program và Dump() giúp quan sát trực tiếp dãy, đối tượng ẩn danh và cấu trúc từng nhóm. Sau khi đối chiếu, cùng logic truy vấn được tổ chức thành các lớp Bai21–Bai62 trong dự án Console và dùng Console.WriteLine để có thể chạy trên VS Code.</w:t>
+        <w:t>Chín tệp LINQPad bao phủ toàn bộ bài từ 2.1 đến 6.2. Chế độ C# Program và Dump() giúp quan sát trực tiếp dãy, đối tượng ẩn danh và cấu trúc từng nhóm. Sau khi đối chiếu, cùng logic truy vấn được tổ chức thành các lớp Bai21–Bai62 trong dự án Console và dùng Console.WriteLine để có thể chạy trên VS Code.</w:t>
       </w:r>
     </w:p>
     <w:p>
@@ -6878,7 +7129,21 @@
                 <w:color w:val="202020"/>
                 <w:sz w:val="17"/>
               </w:rPr>
-              <w:t>Build Release: 0 cảnh báo, 0 lỗi</w:t>
+              <w:t>Console Release: 0 cảnh báo, 0 lỗi</w:t>
+            </w:r>
+          </w:p>
+          <w:p>
+            <w:pPr>
+              <w:spacing w:before="0" w:after="0" w:line="252" w:lineRule="auto"/>
+              <w:jc w:val="left"/>
+            </w:pPr>
+            <w:r>
+              <w:rPr>
+                <w:rFonts w:ascii="Consolas" w:hAnsi="Consolas" w:eastAsia="Consolas"/>
+                <w:color w:val="202020"/>
+                <w:sz w:val="17"/>
+              </w:rPr>
+              <w:t>LINQPad: 9/9 tệp biên dịch kiểm tra thành công</w:t>
             </w:r>
           </w:p>
           <w:p>

</xml_diff>